<commit_message>
Docs: ERS-01 v1.2, CU-01 v2.3 e historias HU-15 a HU-17 con las APIs propias - Camila Olivares
Se agregan los requisitos y casos de uso de las APIs propias, las historias HU-15 a HU-17 con sus criterios (la HU-17 como propuesta) y las tareas S3-13 a S3-18 en el Product Backlog y el Sprint 3. Se cargan las horas reales del sprint, se actualizan los índices y se quitan los RUT del documento de historias.
</commit_message>
<xml_diff>
--- a/Fase 2/Evidencias Proyecto/Evidencias de documentación/2. Metodología Scrum/Documento_de_Épicas_e_Historias_de_Usuario.docx
+++ b/Fase 2/Evidencias Proyecto/Evidencias de documentación/2. Metodología Scrum/Documento_de_Épicas_e_Historias_de_Usuario.docx
@@ -637,10 +637,14 @@
           </w:pPr>
           <w:r>
             <w:fldChar w:fldCharType="begin"/>
+          </w:r>
+          <w:r>
             <w:instrText xml:space="preserve"> TOC \o "1-3" \h \z \u </w:instrText>
+          </w:r>
+          <w:r>
             <w:fldChar w:fldCharType="separate"/>
           </w:r>
-          <w:hyperlink w:anchor="_Toc33409178" w:history="1">
+          <w:hyperlink w:anchor="_Toc243417927" w:history="1">
             <w:r>
               <w:rPr>
                 <w:rStyle w:val="Hipervnculo"/>
@@ -655,10 +659,46 @@
                 <w:webHidden/>
               </w:rPr>
               <w:tab/>
+            </w:r>
+            <w:r>
+              <w:rPr>
+                <w:noProof/>
+                <w:webHidden/>
+              </w:rPr>
               <w:fldChar w:fldCharType="begin"/>
-              <w:instrText xml:space="preserve"> PAGEREF _Toc33409178 \h </w:instrText>
+            </w:r>
+            <w:r>
+              <w:rPr>
+                <w:noProof/>
+                <w:webHidden/>
+              </w:rPr>
+              <w:instrText xml:space="preserve"> PAGEREF _Toc243417927 \h </w:instrText>
+            </w:r>
+            <w:r>
+              <w:rPr>
+                <w:noProof/>
+                <w:webHidden/>
+              </w:rPr>
+            </w:r>
+            <w:r>
+              <w:rPr>
+                <w:noProof/>
+                <w:webHidden/>
+              </w:rPr>
               <w:fldChar w:fldCharType="separate"/>
+            </w:r>
+            <w:r>
+              <w:rPr>
+                <w:noProof/>
+                <w:webHidden/>
+              </w:rPr>
               <w:t>3</w:t>
+            </w:r>
+            <w:r>
+              <w:rPr>
+                <w:noProof/>
+                <w:webHidden/>
+              </w:rPr>
               <w:fldChar w:fldCharType="end"/>
             </w:r>
           </w:hyperlink>
@@ -675,7 +715,7 @@
               <w:lang w:eastAsia="es-CL"/>
             </w:rPr>
           </w:pPr>
-          <w:hyperlink w:anchor="_Toc33409179" w:history="1">
+          <w:hyperlink w:anchor="_Toc243417928" w:history="1">
             <w:r>
               <w:rPr>
                 <w:rStyle w:val="Hipervnculo"/>
@@ -690,10 +730,46 @@
                 <w:webHidden/>
               </w:rPr>
               <w:tab/>
+            </w:r>
+            <w:r>
+              <w:rPr>
+                <w:noProof/>
+                <w:webHidden/>
+              </w:rPr>
               <w:fldChar w:fldCharType="begin"/>
-              <w:instrText xml:space="preserve"> PAGEREF _Toc33409179 \h </w:instrText>
+            </w:r>
+            <w:r>
+              <w:rPr>
+                <w:noProof/>
+                <w:webHidden/>
+              </w:rPr>
+              <w:instrText xml:space="preserve"> PAGEREF _Toc243417928 \h </w:instrText>
+            </w:r>
+            <w:r>
+              <w:rPr>
+                <w:noProof/>
+                <w:webHidden/>
+              </w:rPr>
+            </w:r>
+            <w:r>
+              <w:rPr>
+                <w:noProof/>
+                <w:webHidden/>
+              </w:rPr>
               <w:fldChar w:fldCharType="separate"/>
+            </w:r>
+            <w:r>
+              <w:rPr>
+                <w:noProof/>
+                <w:webHidden/>
+              </w:rPr>
               <w:t>4</w:t>
+            </w:r>
+            <w:r>
+              <w:rPr>
+                <w:noProof/>
+                <w:webHidden/>
+              </w:rPr>
               <w:fldChar w:fldCharType="end"/>
             </w:r>
           </w:hyperlink>
@@ -710,7 +786,7 @@
               <w:lang w:eastAsia="es-CL"/>
             </w:rPr>
           </w:pPr>
-          <w:hyperlink w:anchor="_Toc33409180" w:history="1">
+          <w:hyperlink w:anchor="_Toc243417929" w:history="1">
             <w:r>
               <w:rPr>
                 <w:rStyle w:val="Hipervnculo"/>
@@ -725,10 +801,46 @@
                 <w:webHidden/>
               </w:rPr>
               <w:tab/>
+            </w:r>
+            <w:r>
+              <w:rPr>
+                <w:noProof/>
+                <w:webHidden/>
+              </w:rPr>
               <w:fldChar w:fldCharType="begin"/>
-              <w:instrText xml:space="preserve"> PAGEREF _Toc33409180 \h </w:instrText>
+            </w:r>
+            <w:r>
+              <w:rPr>
+                <w:noProof/>
+                <w:webHidden/>
+              </w:rPr>
+              <w:instrText xml:space="preserve"> PAGEREF _Toc243417929 \h </w:instrText>
+            </w:r>
+            <w:r>
+              <w:rPr>
+                <w:noProof/>
+                <w:webHidden/>
+              </w:rPr>
+            </w:r>
+            <w:r>
+              <w:rPr>
+                <w:noProof/>
+                <w:webHidden/>
+              </w:rPr>
               <w:fldChar w:fldCharType="separate"/>
+            </w:r>
+            <w:r>
+              <w:rPr>
+                <w:noProof/>
+                <w:webHidden/>
+              </w:rPr>
               <w:t>4</w:t>
+            </w:r>
+            <w:r>
+              <w:rPr>
+                <w:noProof/>
+                <w:webHidden/>
+              </w:rPr>
               <w:fldChar w:fldCharType="end"/>
             </w:r>
           </w:hyperlink>
@@ -745,7 +857,7 @@
               <w:lang w:eastAsia="es-CL"/>
             </w:rPr>
           </w:pPr>
-          <w:hyperlink w:anchor="_Toc33409181" w:history="1">
+          <w:hyperlink w:anchor="_Toc243417930" w:history="1">
             <w:r>
               <w:rPr>
                 <w:rStyle w:val="Hipervnculo"/>
@@ -760,10 +872,46 @@
                 <w:webHidden/>
               </w:rPr>
               <w:tab/>
+            </w:r>
+            <w:r>
+              <w:rPr>
+                <w:noProof/>
+                <w:webHidden/>
+              </w:rPr>
               <w:fldChar w:fldCharType="begin"/>
-              <w:instrText xml:space="preserve"> PAGEREF _Toc33409181 \h </w:instrText>
+            </w:r>
+            <w:r>
+              <w:rPr>
+                <w:noProof/>
+                <w:webHidden/>
+              </w:rPr>
+              <w:instrText xml:space="preserve"> PAGEREF _Toc243417930 \h </w:instrText>
+            </w:r>
+            <w:r>
+              <w:rPr>
+                <w:noProof/>
+                <w:webHidden/>
+              </w:rPr>
+            </w:r>
+            <w:r>
+              <w:rPr>
+                <w:noProof/>
+                <w:webHidden/>
+              </w:rPr>
               <w:fldChar w:fldCharType="separate"/>
+            </w:r>
+            <w:r>
+              <w:rPr>
+                <w:noProof/>
+                <w:webHidden/>
+              </w:rPr>
               <w:t>5</w:t>
+            </w:r>
+            <w:r>
+              <w:rPr>
+                <w:noProof/>
+                <w:webHidden/>
+              </w:rPr>
               <w:fldChar w:fldCharType="end"/>
             </w:r>
           </w:hyperlink>
@@ -805,7 +953,7 @@
           <w:rFonts w:eastAsia="Times New Roman"/>
         </w:rPr>
       </w:pPr>
-      <w:bookmarkStart w:id="1" w:name="_Toc33409178"/>
+      <w:bookmarkStart w:id="1" w:name="_Toc243417927"/>
       <w:r>
         <w:rPr>
           <w:rFonts w:eastAsia="Times New Roman"/>
@@ -1029,17 +1177,12 @@
             <w:tcW w:w="1826" w:type="dxa"/>
           </w:tcPr>
           <w:p>
-            <w:pPr>
-              <w:tabs>
-                <w:tab w:val="left" w:pos="1276"/>
-              </w:tabs>
-              <w:rPr>
-                <w:rFonts w:eastAsia="Times New Roman" w:cstheme="minorHAnsi"/>
-                <w:color w:val="000000" w:themeColor="text1"/>
-                <w:sz w:val="24"/>
-                <w:szCs w:val="24"/>
-              </w:rPr>
-            </w:pPr>
+            <w:r>
+              <w:rPr>
+                <w:rFonts w:ascii="Calibri" w:hAnsi="Calibri"/>
+              </w:rPr>
+              <w:t>1.1</w:t>
+            </w:r>
           </w:p>
         </w:tc>
         <w:tc>
@@ -1047,17 +1190,12 @@
             <w:tcW w:w="1826" w:type="dxa"/>
           </w:tcPr>
           <w:p>
-            <w:pPr>
-              <w:tabs>
-                <w:tab w:val="left" w:pos="1276"/>
-              </w:tabs>
-              <w:rPr>
-                <w:rFonts w:eastAsia="Times New Roman" w:cstheme="minorHAnsi"/>
-                <w:color w:val="000000" w:themeColor="text1"/>
-                <w:sz w:val="24"/>
-                <w:szCs w:val="24"/>
-              </w:rPr>
-            </w:pPr>
+            <w:r>
+              <w:rPr>
+                <w:rFonts w:ascii="Calibri" w:hAnsi="Calibri"/>
+              </w:rPr>
+              <w:t>19-10-2026</w:t>
+            </w:r>
           </w:p>
         </w:tc>
         <w:tc>
@@ -1065,17 +1203,12 @@
             <w:tcW w:w="3081" w:type="dxa"/>
           </w:tcPr>
           <w:p>
-            <w:pPr>
-              <w:tabs>
-                <w:tab w:val="left" w:pos="1276"/>
-              </w:tabs>
-              <w:rPr>
-                <w:rFonts w:eastAsia="Times New Roman" w:cstheme="minorHAnsi"/>
-                <w:color w:val="000000" w:themeColor="text1"/>
-                <w:sz w:val="24"/>
-                <w:szCs w:val="24"/>
-              </w:rPr>
-            </w:pPr>
+            <w:r>
+              <w:rPr>
+                <w:rFonts w:ascii="Calibri" w:hAnsi="Calibri"/>
+              </w:rPr>
+              <w:t>Se agregan las historias de las APIs públicas propias: E4-H3 (HU-15), E2-H4 (HU-16) y E6-H2 (HU-17), con sus criterios de aceptación.</w:t>
+            </w:r>
           </w:p>
         </w:tc>
         <w:tc>
@@ -1083,17 +1216,12 @@
             <w:tcW w:w="2245" w:type="dxa"/>
           </w:tcPr>
           <w:p>
-            <w:pPr>
-              <w:tabs>
-                <w:tab w:val="left" w:pos="1276"/>
-              </w:tabs>
-              <w:rPr>
-                <w:rFonts w:eastAsia="Times New Roman" w:cstheme="minorHAnsi"/>
-                <w:color w:val="000000" w:themeColor="text1"/>
-                <w:sz w:val="24"/>
-                <w:szCs w:val="24"/>
-              </w:rPr>
-            </w:pPr>
+            <w:r>
+              <w:rPr>
+                <w:rFonts w:ascii="Calibri" w:hAnsi="Calibri"/>
+              </w:rPr>
+              <w:t>Camila Olivares</w:t>
+            </w:r>
           </w:p>
         </w:tc>
       </w:tr>
@@ -1964,7 +2092,7 @@
           <w:rFonts w:eastAsia="Times New Roman"/>
         </w:rPr>
       </w:pPr>
-      <w:bookmarkStart w:id="4" w:name="_Toc33409179"/>
+      <w:bookmarkStart w:id="4" w:name="_Toc243417928"/>
       <w:r>
         <w:rPr>
           <w:rFonts w:eastAsia="Times New Roman"/>
@@ -2307,7 +2435,7 @@
           <w:rFonts w:eastAsia="Times New Roman"/>
         </w:rPr>
       </w:pPr>
-      <w:bookmarkStart w:id="5" w:name="_Toc33409180"/>
+      <w:bookmarkStart w:id="5" w:name="_Toc243417929"/>
       <w:r>
         <w:rPr>
           <w:rFonts w:eastAsia="Times New Roman"/>
@@ -2342,7 +2470,7 @@
               <w:rPr>
                 <w:rFonts w:ascii="Calibri" w:hAnsi="Calibri"/>
               </w:rPr>
-              <w:t xml:space="preserve">Cada épica se clasificó según su valor de negocio para el flujo comercial-productivo definido en el alcance del proyecto: se asignó prioridad Alta a las épicas indispensables para completar el ciclo presupuesto-cotización-orden de compra-orden de trabajo-pago, el CRUD completo exigido por la asignatura y los requisitos obligatorios del docente (trazabilidad, seguridad y auditoría); se asignó prioridad Media a las épicas que aportan valor complementario sin bloquear el flujo principal. Esta clasificación es consistente con la prioridad asignada a nivel de historia de usuario en el Product Backlog.</w:t>
+              <w:t>Cada épica se clasificó según su valor de negocio para el flujo comercial-productivo definido en el alcance del proyecto: se asignó prioridad Alta a las épicas indispensables para completar el ciclo presupuesto-cotización-orden de compra-orden de trabajo-pago, el CRUD completo exigido por la asignatura y los requisitos obligatorios del docente (trazabilidad, seguridad y auditoría); se asignó prioridad Media a las épicas que aportan valor complementario sin bloquear el flujo principal. Esta clasificación es consistente con la prioridad asignada a nivel de historia de usuario en el Product Backlog.</w:t>
             </w:r>
           </w:p>
         </w:tc>
@@ -2844,7 +2972,7 @@
           <w:rFonts w:eastAsia="Times New Roman"/>
         </w:rPr>
       </w:pPr>
-      <w:bookmarkStart w:id="6" w:name="_Toc33409181"/>
+      <w:bookmarkStart w:id="6" w:name="_Toc243417930"/>
       <w:r>
         <w:rPr>
           <w:rFonts w:eastAsia="Times New Roman"/>
@@ -2865,7 +2993,7 @@
           <w:noProof/>
         </w:rPr>
         <w:drawing>
-          <wp:inline distT="0" distB="0" distL="0" distR="0" wp14:anchorId="54101559" wp14:editId="080FDAFE">
+          <wp:inline distT="0" distB="0" distL="0" distR="0" wp14:anchorId="48B15E9D" wp14:editId="57878886">
             <wp:extent cx="5612130" cy="1300480"/>
             <wp:effectExtent l="0" t="0" r="7620" b="0"/>
             <wp:docPr id="1" name="Imagen 1"/>
@@ -2930,7 +3058,7 @@
         </w:rPr>
         <w:lastRenderedPageBreak/>
         <w:drawing>
-          <wp:inline distT="0" distB="0" distL="0" distR="0" wp14:anchorId="6350E5B6" wp14:editId="31897419">
+          <wp:inline distT="0" distB="0" distL="0" distR="0" wp14:anchorId="058D4E35" wp14:editId="18FDEC59">
             <wp:extent cx="6031230" cy="1668952"/>
             <wp:effectExtent l="0" t="0" r="0" b="0"/>
             <wp:docPr id="10" name="image3.png"/>
@@ -2987,7 +3115,7 @@
           <w:noProof/>
         </w:rPr>
         <w:drawing>
-          <wp:inline distT="0" distB="0" distL="0" distR="0" wp14:anchorId="0137BC07" wp14:editId="5234FCF5">
+          <wp:inline distT="0" distB="0" distL="0" distR="0" wp14:anchorId="6060C26F" wp14:editId="7B100DB0">
             <wp:extent cx="6031230" cy="2030023"/>
             <wp:effectExtent l="0" t="0" r="0" b="0"/>
             <wp:docPr id="11" name="image4.png"/>
@@ -3044,7 +3172,7 @@
           <w:noProof/>
         </w:rPr>
         <w:drawing>
-          <wp:inline distT="0" distB="0" distL="0" distR="0" wp14:anchorId="55D9277C" wp14:editId="06CC953F">
+          <wp:inline distT="0" distB="0" distL="0" distR="0" wp14:anchorId="31EA1253" wp14:editId="7BCDB784">
             <wp:extent cx="6031230" cy="2115611"/>
             <wp:effectExtent l="0" t="0" r="0" b="0"/>
             <wp:docPr id="12" name="image5.png"/>
@@ -3087,14 +3215,174 @@
         </w:drawing>
       </w:r>
     </w:p>
+    <w:p>
+      <w:pPr>
+        <w:keepNext/>
+      </w:pPr>
+      <w:r>
+        <w:lastRenderedPageBreak/>
+        <w:t>Historia 4 · E4-H3 (HU-15): API de seguimiento de pedidos</w:t>
+      </w:r>
+    </w:p>
+    <w:p>
+      <w:pPr>
+        <w:jc w:val="center"/>
+      </w:pPr>
+      <w:r>
+        <w:rPr>
+          <w:noProof/>
+        </w:rPr>
+        <w:drawing>
+          <wp:inline distT="0" distB="0" distL="0" distR="0" wp14:anchorId="1E063A17" wp14:editId="6FEF5700">
+            <wp:extent cx="6035040" cy="2181340"/>
+            <wp:effectExtent l="0" t="0" r="0" b="0"/>
+            <wp:docPr id="13" name="Picture 13"/>
+            <wp:cNvGraphicFramePr>
+              <a:graphicFrameLocks xmlns:a="http://schemas.openxmlformats.org/drawingml/2006/main" noChangeAspect="1"/>
+            </wp:cNvGraphicFramePr>
+            <a:graphic xmlns:a="http://schemas.openxmlformats.org/drawingml/2006/main">
+              <a:graphicData uri="http://schemas.openxmlformats.org/drawingml/2006/picture">
+                <pic:pic xmlns:pic="http://schemas.openxmlformats.org/drawingml/2006/picture">
+                  <pic:nvPicPr>
+                    <pic:cNvPr id="0" name="h0_crop.png"/>
+                    <pic:cNvPicPr/>
+                  </pic:nvPicPr>
+                  <pic:blipFill>
+                    <a:blip r:embed="rId12"/>
+                    <a:stretch>
+                      <a:fillRect/>
+                    </a:stretch>
+                  </pic:blipFill>
+                  <pic:spPr>
+                    <a:xfrm>
+                      <a:off x="0" y="0"/>
+                      <a:ext cx="6035040" cy="2181340"/>
+                    </a:xfrm>
+                    <a:prstGeom prst="rect">
+                      <a:avLst/>
+                    </a:prstGeom>
+                  </pic:spPr>
+                </pic:pic>
+              </a:graphicData>
+            </a:graphic>
+          </wp:inline>
+        </w:drawing>
+      </w:r>
+    </w:p>
+    <w:p>
+      <w:pPr>
+        <w:keepNext/>
+      </w:pPr>
+      <w:r>
+        <w:t>Historia 5 · E2-H4 (HU-16): API del cotizador</w:t>
+      </w:r>
+    </w:p>
+    <w:p>
+      <w:pPr>
+        <w:jc w:val="center"/>
+      </w:pPr>
+      <w:r>
+        <w:rPr>
+          <w:noProof/>
+        </w:rPr>
+        <w:drawing>
+          <wp:inline distT="0" distB="0" distL="0" distR="0" wp14:anchorId="4BE98240" wp14:editId="5836B6C7">
+            <wp:extent cx="6035040" cy="2181340"/>
+            <wp:effectExtent l="0" t="0" r="0" b="0"/>
+            <wp:docPr id="14" name="Picture 14"/>
+            <wp:cNvGraphicFramePr>
+              <a:graphicFrameLocks xmlns:a="http://schemas.openxmlformats.org/drawingml/2006/main" noChangeAspect="1"/>
+            </wp:cNvGraphicFramePr>
+            <a:graphic xmlns:a="http://schemas.openxmlformats.org/drawingml/2006/main">
+              <a:graphicData uri="http://schemas.openxmlformats.org/drawingml/2006/picture">
+                <pic:pic xmlns:pic="http://schemas.openxmlformats.org/drawingml/2006/picture">
+                  <pic:nvPicPr>
+                    <pic:cNvPr id="0" name="h1_crop.png"/>
+                    <pic:cNvPicPr/>
+                  </pic:nvPicPr>
+                  <pic:blipFill>
+                    <a:blip r:embed="rId13"/>
+                    <a:stretch>
+                      <a:fillRect/>
+                    </a:stretch>
+                  </pic:blipFill>
+                  <pic:spPr>
+                    <a:xfrm>
+                      <a:off x="0" y="0"/>
+                      <a:ext cx="6035040" cy="2181340"/>
+                    </a:xfrm>
+                    <a:prstGeom prst="rect">
+                      <a:avLst/>
+                    </a:prstGeom>
+                  </pic:spPr>
+                </pic:pic>
+              </a:graphicData>
+            </a:graphic>
+          </wp:inline>
+        </w:drawing>
+      </w:r>
+    </w:p>
+    <w:p>
+      <w:pPr>
+        <w:keepNext/>
+      </w:pPr>
+      <w:r>
+        <w:t>Historia 6 · E6-H2 (HU-17): API de disponibilidad de materiales</w:t>
+      </w:r>
+    </w:p>
+    <w:p>
+      <w:pPr>
+        <w:jc w:val="center"/>
+      </w:pPr>
+      <w:r>
+        <w:rPr>
+          <w:noProof/>
+        </w:rPr>
+        <w:drawing>
+          <wp:inline distT="0" distB="0" distL="0" distR="0" wp14:anchorId="460ECEDA" wp14:editId="412263E0">
+            <wp:extent cx="6035040" cy="2181340"/>
+            <wp:effectExtent l="0" t="0" r="0" b="0"/>
+            <wp:docPr id="15" name="Picture 15"/>
+            <wp:cNvGraphicFramePr>
+              <a:graphicFrameLocks xmlns:a="http://schemas.openxmlformats.org/drawingml/2006/main" noChangeAspect="1"/>
+            </wp:cNvGraphicFramePr>
+            <a:graphic xmlns:a="http://schemas.openxmlformats.org/drawingml/2006/main">
+              <a:graphicData uri="http://schemas.openxmlformats.org/drawingml/2006/picture">
+                <pic:pic xmlns:pic="http://schemas.openxmlformats.org/drawingml/2006/picture">
+                  <pic:nvPicPr>
+                    <pic:cNvPr id="0" name="h2_crop.png"/>
+                    <pic:cNvPicPr/>
+                  </pic:nvPicPr>
+                  <pic:blipFill>
+                    <a:blip r:embed="rId14"/>
+                    <a:stretch>
+                      <a:fillRect/>
+                    </a:stretch>
+                  </pic:blipFill>
+                  <pic:spPr>
+                    <a:xfrm>
+                      <a:off x="0" y="0"/>
+                      <a:ext cx="6035040" cy="2181340"/>
+                    </a:xfrm>
+                    <a:prstGeom prst="rect">
+                      <a:avLst/>
+                    </a:prstGeom>
+                  </pic:spPr>
+                </pic:pic>
+              </a:graphicData>
+            </a:graphic>
+          </wp:inline>
+        </w:drawing>
+      </w:r>
+    </w:p>
     <w:p/>
     <w:p/>
     <w:p/>
     <w:p/>
     <w:p/>
     <w:sectPr>
-      <w:headerReference w:type="default" r:id="rId12"/>
-      <w:footerReference w:type="default" r:id="rId13"/>
+      <w:headerReference w:type="default" r:id="rId15"/>
+      <w:footerReference w:type="default" r:id="rId16"/>
       <w:pgSz w:w="12240" w:h="15840"/>
       <w:pgMar w:top="1418" w:right="1701" w:bottom="1418" w:left="1701" w:header="709" w:footer="709" w:gutter="0"/>
       <w:cols w:space="708"/>
@@ -3249,7 +3537,7 @@
         <w:lang w:eastAsia="es-CL"/>
       </w:rPr>
       <w:drawing>
-        <wp:anchor distT="0" distB="0" distL="114300" distR="114300" simplePos="0" relativeHeight="251659264" behindDoc="0" locked="0" layoutInCell="1" allowOverlap="1" wp14:anchorId="5C985C8A" wp14:editId="5C22FCF6">
+        <wp:anchor distT="0" distB="0" distL="114300" distR="114300" simplePos="0" relativeHeight="251659264" behindDoc="0" locked="0" layoutInCell="1" allowOverlap="1" wp14:anchorId="559EEDA1" wp14:editId="4D0F2B4E">
           <wp:simplePos x="0" y="0"/>
           <wp:positionH relativeFrom="column">
             <wp:posOffset>131977</wp:posOffset>

</xml_diff>